<commit_message>
writing first draft of protocol
</commit_message>
<xml_diff>
--- a/protocols/protocol.docx
+++ b/protocols/protocol.docx
@@ -74,9 +74,35 @@
         <w:pStyle w:val="Date"/>
       </w:pPr>
       <w:r>
-        <w:t xml:space="preserve">22 May 2026</w:t>
-      </w:r>
-    </w:p>
+        <w:t xml:space="preserve">24 June 2026</w:t>
+      </w:r>
+    </w:p>
+    <w:sdt>
+      <w:sdtPr>
+        <w:docPartObj>
+          <w:docPartGallery w:val="Table of Contents"/>
+          <w:docPartUnique/>
+        </w:docPartObj>
+      </w:sdtPr>
+      <w:sdtContent>
+        <w:p>
+          <w:pPr>
+            <w:pStyle w:val="TOCHeading"/>
+          </w:pPr>
+          <w:r>
+            <w:t xml:space="preserve">Table of contents</w:t>
+          </w:r>
+        </w:p>
+        <w:p>
+          <w:r>
+            <w:fldChar w:fldCharType="begin" w:dirty="true"/>
+            <w:instrText xml:space="preserve">TOC \o "1-3" \h \z \u</w:instrText>
+            <w:fldChar w:fldCharType="separate"/>
+            <w:fldChar w:fldCharType="end"/>
+          </w:r>
+        </w:p>
+      </w:sdtContent>
+    </w:sdt>
     <w:p>
       <w:pPr>
         <w:pStyle w:val="FirstParagraph"/>
@@ -248,7 +274,7 @@
         <w:pStyle w:val="FirstParagraph"/>
       </w:pPr>
       <w:r>
-        <w:t xml:space="preserve">Ninety-eight percent of people living with advanced chronic kidney disease (CKD) — stages 4 and 5, not receiving kidney replacement therapy (KRT) — live with multiple long-term conditions</w:t>
+        <w:t xml:space="preserve">Ninety-eight percent of people living with advanced chronic kidney disease (CKD) - stages 4 and 5, not receiving kidney replacement therapy (KRT) - live with multiple long-term conditions</w:t>
       </w:r>
       <w:r>
         <w:t xml:space="preserve"> </w:t>
@@ -257,7 +283,7 @@
         <w:t xml:space="preserve">(2)</w:t>
       </w:r>
       <w:r>
-        <w:t xml:space="preserve">. Resultantly, polypharmacy is highly prevalent</w:t>
+        <w:t xml:space="preserve">. Resultantly, polypharmacy is highly prevalent, and this gruop are prescribed on average 8-9 medicines per day (&gt;100 pills per week)</w:t>
       </w:r>
       <w:r>
         <w:t xml:space="preserve"> </w:t>
@@ -275,7 +301,7 @@
         <w:t xml:space="preserve">(4)</w:t>
       </w:r>
       <w:r>
-        <w:t xml:space="preserve">, hence it is a key action area in the World Health Organisation’s current Global Patient Safety Challenge:</w:t>
+        <w:t xml:space="preserve">, hence addressing it is a key action area in the World Health Organisation’s current Global Patient Safety Challenge:</w:t>
       </w:r>
       <w:r>
         <w:t xml:space="preserve"> </w:t>
@@ -294,7 +320,7 @@
         <w:t xml:space="preserve">(5)</w:t>
       </w:r>
       <w:r>
-        <w:t xml:space="preserve">. For people with reduced kidney function, the risk of harm is augmented by unpredictable drug handling and excretion and therefore they are a high priority group to study</w:t>
+        <w:t xml:space="preserve">. For people with reduced kidney function, the risk of harm is augmented by unpredictable drug handling and excretion - 1 in 5 experience a medication-related harm each year [REF] - and therefore they are a high priority group to study</w:t>
       </w:r>
       <w:r>
         <w:t xml:space="preserve"> </w:t>
@@ -311,7 +337,7 @@
         <w:pStyle w:val="BodyText"/>
       </w:pPr>
       <w:r>
-        <w:t xml:space="preserve">Added to this, people with reduced kidney function are systematically excluded from studies in which the safety and efficacy of drugs is assessed</w:t>
+        <w:t xml:space="preserve">Added to this, clinical trials that establish the safety and effectiveness of medicines rarely include people living with advanced kidney disease, and instead include populations that do not reflect their comorbidity and diversity</w:t>
       </w:r>
       <w:r>
         <w:t xml:space="preserve"> </w:t>
@@ -320,10 +346,7 @@
         <w:t xml:space="preserve">(7)</w:t>
       </w:r>
       <w:r>
-        <w:t xml:space="preserve"> </w:t>
-      </w:r>
-      <w:r>
-        <w:t xml:space="preserve">and so we actually have limited evidence to guide prescribing in this group.</w:t>
+        <w:t xml:space="preserve">.</w:t>
       </w:r>
     </w:p>
     <w:p>
@@ -331,7 +354,7 @@
         <w:pStyle w:val="BodyText"/>
       </w:pPr>
       <w:r>
-        <w:t xml:space="preserve">Deprescribing — the systematic process of stopping or reducing medicines — is a proposed way of reducing the harms associated with polypharmacy. However, despite recent KDIGO (Kidney Disease | Improving Global Outcomes) CKD practice guidelines containing a new section on</w:t>
+        <w:t xml:space="preserve">Deprescribing - the systematic process of stopping or reducing medicines - is a proposed way of reducing the harms associated with polypharmacy. However, despite a new chapter in the recent KDIGO (Kidney Disease | Improving Global Outcomes) CKD practice guidelines update entitled</w:t>
       </w:r>
       <w:r>
         <w:t xml:space="preserve"> </w:t>
@@ -344,7 +367,7 @@
         <w:t xml:space="preserve">Medication management and Drug Stewardship</w:t>
       </w:r>
       <w:r>
-        <w:t xml:space="preserve">, there is acknowledgment from the authors that evidence to guide deprescribing is limited</w:t>
+        <w:t xml:space="preserve">, there is an acknowledgment that evidence to guide deprescribing is limited</w:t>
       </w:r>
       <w:r>
         <w:t xml:space="preserve"> </w:t>
@@ -361,7 +384,7 @@
         <w:pStyle w:val="BodyText"/>
       </w:pPr>
       <w:r>
-        <w:t xml:space="preserve">Research has shown that a small number of people with advanced kidney disease are having medications such as statins and proton pump inhibitors deprescribed in their last years of life</w:t>
+        <w:t xml:space="preserve">Research has shown that a small number of people with advanced kidney disease are having medications such as statins and proton pump inhibitors discontinued in their last years of life</w:t>
       </w:r>
       <w:r>
         <w:t xml:space="preserve"> </w:t>
@@ -370,7 +393,7 @@
         <w:t xml:space="preserve">(9)</w:t>
       </w:r>
       <w:r>
-        <w:t xml:space="preserve">, but information about patterns and predictors of deprescribing at a population level are lacking.</w:t>
+        <w:t xml:space="preserve">, but information about patterns and predictors of discontinuation at a population level are lacking.</w:t>
       </w:r>
     </w:p>
     <w:p>
@@ -436,6 +459,14 @@
       </w:pPr>
       <w:r>
         <w:t xml:space="preserve">James Lind Alliance priority for understanding medicines in older life.</w:t>
+      </w:r>
+    </w:p>
+    <w:p>
+      <w:pPr>
+        <w:pStyle w:val="FirstParagraph"/>
+      </w:pPr>
+      <w:r>
+        <w:t xml:space="preserve">We therefore aim to describe the current patterns of discontinuation of common medicines in people living with advanced CKD in England, and evaluate the clinical and sociodemographic factors that lead to variances in these patterns.</w:t>
       </w:r>
     </w:p>
     <w:bookmarkEnd w:id="9"/>
@@ -457,7 +488,7 @@
         </w:numPr>
       </w:pPr>
       <w:r>
-        <w:t xml:space="preserve">To establish the patterns of discontinuation of long-term medicines in people in England living with advanced CKD.</w:t>
+        <w:t xml:space="preserve">To describe patterns of prescribing at a national level for people living with advanced CKD</w:t>
       </w:r>
     </w:p>
     <w:p>
@@ -469,19 +500,19 @@
         </w:numPr>
       </w:pPr>
       <w:r>
+        <w:t xml:space="preserve">To establish the patterns of discontinuation of medicines in people in England living with advanced CKD.</w:t>
+      </w:r>
+    </w:p>
+    <w:p>
+      <w:pPr>
+        <w:pStyle w:val="Compact"/>
+        <w:numPr>
+          <w:ilvl w:val="0"/>
+          <w:numId w:val="1002"/>
+        </w:numPr>
+      </w:pPr>
+      <w:r>
         <w:t xml:space="preserve">To identify the clinical and sociodemographic factors associated with variances in these patterns.</w:t>
-      </w:r>
-    </w:p>
-    <w:p>
-      <w:pPr>
-        <w:pStyle w:val="Compact"/>
-        <w:numPr>
-          <w:ilvl w:val="0"/>
-          <w:numId w:val="1002"/>
-        </w:numPr>
-      </w:pPr>
-      <w:r>
-        <w:t xml:space="preserve">To operationalise an appropriate definition of medication discontinuation.</w:t>
       </w:r>
     </w:p>
     <w:p>
@@ -505,7 +536,7 @@
       </w:r>
     </w:p>
     <w:bookmarkEnd w:id="10"/>
-    <w:bookmarkStart w:id="37" w:name="methods"/>
+    <w:bookmarkStart w:id="39" w:name="methods"/>
     <w:p>
       <w:pPr>
         <w:pStyle w:val="Heading1"/>
@@ -570,7 +601,7 @@
         </w:numPr>
       </w:pPr>
       <w:r>
-        <w:t xml:space="preserve">NHS Secondary Uses Service data, which is used to derive ethnicity information and to help identify individuals in receipt of KRT</w:t>
+        <w:t xml:space="preserve">NHS Secondary Uses Service data, which includes information regarding hospital admissions, and is used to derive each individual’s ethnicity</w:t>
       </w:r>
     </w:p>
     <w:bookmarkEnd w:id="12"/>
@@ -712,10 +743,7 @@
         </w:numPr>
       </w:pPr>
       <w:r>
-        <w:t xml:space="preserve">SNOMED codes for CKD 4 and 5 as published on</w:t>
-      </w:r>
-      <w:r>
-        <w:t xml:space="preserve"> </w:t>
+        <w:t xml:space="preserve">A SNOMED code indicating a diagnosis of CKD 4 and 5 (</w:t>
       </w:r>
       <w:hyperlink r:id="rId14">
         <w:r>
@@ -726,7 +754,7 @@
         </w:r>
       </w:hyperlink>
       <w:r>
-        <w:t xml:space="preserve">.</w:t>
+        <w:t xml:space="preserve">) on any prior date.</w:t>
       </w:r>
     </w:p>
     <w:bookmarkEnd w:id="15"/>
@@ -748,7 +776,7 @@
         </w:numPr>
       </w:pPr>
       <w:r>
-        <w:t xml:space="preserve">People who have been coded to receive kidney replacement therapy (KRT) of any sort (dialysis or transplant) prior to the index date, or on the index date itself. KRT will be defined using established primary and secondary care</w:t>
+        <w:t xml:space="preserve">People in receipt of kidney replacement therapy (KRT). This is defined as a</w:t>
       </w:r>
       <w:r>
         <w:t xml:space="preserve"> </w:t>
@@ -758,14 +786,14 @@
           <w:rPr>
             <w:rStyle w:val="Hyperlink"/>
           </w:rPr>
-          <w:t xml:space="preserve">codes</w:t>
+          <w:t xml:space="preserve">code</w:t>
         </w:r>
       </w:hyperlink>
       <w:r>
         <w:t xml:space="preserve"> </w:t>
       </w:r>
       <w:r>
-        <w:t xml:space="preserve">that have been shown to be sensitive for identifying the prevalent KRT population in England</w:t>
+        <w:t xml:space="preserve">indicating dialysis or transplant prior to the index date, or on the index date itself. This method has been shown to be sensitive for identifying the prevalent KRT population in England</w:t>
       </w:r>
       <w:r>
         <w:t xml:space="preserve"> </w:t>
@@ -912,7 +940,7 @@
         </w:numPr>
       </w:pPr>
       <w:r>
-        <w:t xml:space="preserve">Known IMD</w:t>
+        <w:t xml:space="preserve">(Known IMD</w:t>
       </w:r>
     </w:p>
     <w:p>
@@ -936,12 +964,22 @@
         </w:numPr>
       </w:pPr>
       <w:r>
-        <w:t xml:space="preserve">Known STP</w:t>
+        <w:t xml:space="preserve">Known STP) -</w:t>
+      </w:r>
+      <w:r>
+        <w:t xml:space="preserve"> </w:t>
+      </w:r>
+      <w:r>
+        <w:rPr>
+          <w:i/>
+          <w:iCs/>
+        </w:rPr>
+        <w:t xml:space="preserve">I’m not sure about these bottom three - they may well exclude people unnecessarily</w:t>
       </w:r>
     </w:p>
     <w:bookmarkEnd w:id="19"/>
     <w:bookmarkEnd w:id="20"/>
-    <w:bookmarkStart w:id="24" w:name="medication-data"/>
+    <w:bookmarkStart w:id="25" w:name="medication-data"/>
     <w:p>
       <w:pPr>
         <w:pStyle w:val="Heading2"/>
@@ -963,48 +1001,7 @@
         <w:pStyle w:val="BodyText"/>
       </w:pPr>
       <w:r>
-        <w:t xml:space="preserve">The medication table within OpenSAFELY-TPP contains information for every medication that is prescribed in primary care. This information is recorded as</w:t>
-      </w:r>
-      <w:r>
-        <w:t xml:space="preserve"> </w:t>
-      </w:r>
-      <w:r>
-        <w:t xml:space="preserve">‘date’</w:t>
-      </w:r>
-      <w:r>
-        <w:t xml:space="preserve"> </w:t>
-      </w:r>
-      <w:r>
-        <w:t xml:space="preserve">of prescription and</w:t>
-      </w:r>
-      <w:r>
-        <w:t xml:space="preserve"> </w:t>
-      </w:r>
-      <w:r>
-        <w:t xml:space="preserve">‘dictionary of medicines and devices (dm+d) code’</w:t>
-      </w:r>
-      <w:r>
-        <w:t xml:space="preserve"> </w:t>
-      </w:r>
-      <w:r>
-        <w:t xml:space="preserve">corresponding to the prescription. Dm+d codes are the preferred mechanism through which medicinal product identification and communication occurs within the NHS. In OpenSAFELY, each dm+d code corresponds to the name (e.g. atorvastatin), strength (e.g. 40mg) and formulation (e.g. tablet) of a prescribed drug. Data on the dosing recommendation (e.g. take 1 tablet once a day), the amount of medication prescribed (e.g. 28 tablets), whether a prescription was issued, or whether the patient took the medication as prescribed are not available.</w:t>
-      </w:r>
-    </w:p>
-    <w:bookmarkStart w:id="23" w:name="medication-data-handling"/>
-    <w:p>
-      <w:pPr>
-        <w:pStyle w:val="Heading3"/>
-      </w:pPr>
-      <w:r>
-        <w:t xml:space="preserve">3.4.1 Medication data handling</w:t>
-      </w:r>
-    </w:p>
-    <w:p>
-      <w:pPr>
-        <w:pStyle w:val="FirstParagraph"/>
-      </w:pPr>
-      <w:r>
-        <w:t xml:space="preserve">Each medication will have its dm+d code mapped to its corresponding British National Formulary (BNF) substance code using publicly available</w:t>
+        <w:t xml:space="preserve">The medication table within OpenSAFELY-TPP contains information for every medication that is prescribed in primary care. Each prescription is recorded using its corresponding NHS dictionary of medicines and devices (dm+d) code and corresponding date.</w:t>
       </w:r>
       <w:r>
         <w:t xml:space="preserve"> </w:t>
@@ -1014,11 +1011,31 @@
           <w:rPr>
             <w:rStyle w:val="Hyperlink"/>
           </w:rPr>
-          <w:t xml:space="preserve">mapping data</w:t>
+          <w:t xml:space="preserve">dm+d codes</w:t>
         </w:r>
       </w:hyperlink>
       <w:r>
-        <w:t xml:space="preserve">. BNF codes follow a clear hierarchical structure and allow for clinically meaningful analysis. Each dm+d code has one or more official routes of administration, which themselves are coded using unique SNOMED identifiers. Mapping of these routes will be performed using publicly available data from</w:t>
+        <w:t xml:space="preserve"> </w:t>
+      </w:r>
+      <w:r>
+        <w:t xml:space="preserve">are the preferred mechanism through which medicinal product identification and communication occurs within the NHS. In OpenSAFELY, each dm+d code corresponds to the name (e.g. atorvastatin), strength (e.g. 40mg) and formulation (e.g. tablet) of a prescribed drug. Data on the dosing recommendation (e.g. take 1 tablet once a day), the quantity of a medication prescribed (e.g. 28 tablets), whether a prescription was dispensed, or whether the patient adhered to the medication as prescribed are not available.</w:t>
+      </w:r>
+    </w:p>
+    <w:bookmarkStart w:id="24" w:name="medication-data-handling"/>
+    <w:p>
+      <w:pPr>
+        <w:pStyle w:val="Heading3"/>
+      </w:pPr>
+      <w:r>
+        <w:t xml:space="preserve">3.4.1 Medication data handling</w:t>
+      </w:r>
+    </w:p>
+    <w:p>
+      <w:pPr>
+        <w:pStyle w:val="FirstParagraph"/>
+      </w:pPr>
+      <w:r>
+        <w:t xml:space="preserve">Each dm+d code has one or more official routes of administration and these will be mapped to the study data using publicly available</w:t>
       </w:r>
       <w:r>
         <w:t xml:space="preserve"> </w:t>
@@ -1035,7 +1052,7 @@
         <w:t xml:space="preserve"> </w:t>
       </w:r>
       <w:r>
-        <w:t xml:space="preserve">(Technology Reference data Update Distribution). Each of the 79 official routes of administration will be mapped to one of the following categories: oral, topical, inhaled, eye/ear/nasal, oromucosal, rectal/vaginal, transdermal, intramuscular, intravenous, subcutaneous and other. Those with multiple licensed routes will be attributed</w:t>
+        <w:t xml:space="preserve">(Technology Reference data Update Distribution) reference files. Each of the 79 official routes of administration will be mapped according to author consensus to one of the following categories: oral, topical, inhaled, eye/ear/nasal, oromucosal, rectal/vaginal, transdermal, intramuscular, intravenous, subcutaneous and other. If a dm+d code has multiple licensed routes it will be classified</w:t>
       </w:r>
       <w:r>
         <w:t xml:space="preserve"> </w:t>
@@ -1044,7 +1061,7 @@
         <w:t xml:space="preserve">‘multiple routes’</w:t>
       </w:r>
       <w:r>
-        <w:t xml:space="preserve">, and those with no licensed routes will be attributed</w:t>
+        <w:t xml:space="preserve">, and if no licensed routes,</w:t>
       </w:r>
       <w:r>
         <w:t xml:space="preserve"> </w:t>
@@ -1056,15 +1073,37 @@
         <w:t xml:space="preserve">.</w:t>
       </w:r>
     </w:p>
-    <w:bookmarkEnd w:id="23"/>
+    <w:p>
+      <w:pPr>
+        <w:pStyle w:val="BodyText"/>
+      </w:pPr>
+      <w:r>
+        <w:t xml:space="preserve">Each medication will then have its dm+d code mapped to its corresponding British National Formulary (BNF) substance code using publicly available</w:t>
+      </w:r>
+      <w:r>
+        <w:t xml:space="preserve"> </w:t>
+      </w:r>
+      <w:hyperlink r:id="rId23">
+        <w:r>
+          <w:rPr>
+            <w:rStyle w:val="Hyperlink"/>
+          </w:rPr>
+          <w:t xml:space="preserve">mapping data</w:t>
+        </w:r>
+      </w:hyperlink>
+      <w:r>
+        <w:t xml:space="preserve">. BNF codes follow a clear hierarchical structure and allow for clinically meaningful analysis.</w:t>
+      </w:r>
+    </w:p>
     <w:bookmarkEnd w:id="24"/>
-    <w:bookmarkStart w:id="28" w:name="baseline-medications"/>
+    <w:bookmarkEnd w:id="25"/>
+    <w:bookmarkStart w:id="29" w:name="medication-inclusion-exclusion"/>
     <w:p>
       <w:pPr>
         <w:pStyle w:val="Heading2"/>
       </w:pPr>
       <w:r>
-        <w:t xml:space="preserve">3.5 Baseline medications</w:t>
+        <w:t xml:space="preserve">3.5 Medication inclusion / exclusion</w:t>
       </w:r>
     </w:p>
     <w:p>
@@ -1072,7 +1111,7 @@
         <w:pStyle w:val="FirstParagraph"/>
       </w:pPr>
       <w:r>
-        <w:t xml:space="preserve">When considering which baseline medications to include in our analyses we have used previously described methods. These suggest categorising medications for based on their</w:t>
+        <w:t xml:space="preserve">Medicines will be included / excluded in our analysis by considering their</w:t>
       </w:r>
       <w:r>
         <w:t xml:space="preserve"> </w:t>
@@ -1094,7 +1133,7 @@
         <w:t xml:space="preserve">.</w:t>
       </w:r>
     </w:p>
-    <w:bookmarkStart w:id="25" w:name="scope"/>
+    <w:bookmarkStart w:id="26" w:name="scope"/>
     <w:p>
       <w:pPr>
         <w:pStyle w:val="Heading3"/>
@@ -1108,37 +1147,43 @@
         <w:pStyle w:val="FirstParagraph"/>
       </w:pPr>
       <w:r>
-        <w:t xml:space="preserve">In the primary analysis, drugs within scope will be defined as:</w:t>
-      </w:r>
-      <w:r>
-        <w:t xml:space="preserve"> </w:t>
-      </w:r>
-      <w:r>
-        <w:t xml:space="preserve">- Drug type - those within BNF chapters 1 to 13. BNF chapters 14 to 23 will be excluded as they represent specialist medicinal products and medical devices.</w:t>
-      </w:r>
-      <w:r>
-        <w:t xml:space="preserve"> </w:t>
-      </w:r>
-      <w:r>
-        <w:t xml:space="preserve">- Route - those that are orally administered. This is because oral medications are the most likely to be deprescribed in this population.</w:t>
-      </w:r>
-    </w:p>
-    <w:p>
-      <w:pPr>
-        <w:pStyle w:val="BodyText"/>
-      </w:pPr>
-      <w:r>
-        <w:t xml:space="preserve">In sensitivity analyses, we will explore the effect of including drugs that are administered through other routes.</w:t>
-      </w:r>
-      <w:r>
-        <w:t xml:space="preserve"> </w:t>
-      </w:r>
-      <w:r>
-        <w:t xml:space="preserve">Importantly, it will not be possible to distinguish PRN (as required) prescriptions from regular prescriptions, and so all medications will be assumed regular.</w:t>
-      </w:r>
-    </w:p>
-    <w:bookmarkEnd w:id="25"/>
-    <w:bookmarkStart w:id="26" w:name="uniqueness"/>
+        <w:t xml:space="preserve">We will include medications based on their drug type and route.</w:t>
+      </w:r>
+    </w:p>
+    <w:p>
+      <w:pPr>
+        <w:pStyle w:val="Compact"/>
+        <w:numPr>
+          <w:ilvl w:val="0"/>
+          <w:numId w:val="1009"/>
+        </w:numPr>
+      </w:pPr>
+      <w:r>
+        <w:t xml:space="preserve">Drug type. We will include medications within BNF chapters 1 to 13. BNF chapters 14 to 23 will be excluded as they represent specialist products that are unlikely to be common and not targets for discontinuation, and medical devices.</w:t>
+      </w:r>
+    </w:p>
+    <w:p>
+      <w:pPr>
+        <w:pStyle w:val="Compact"/>
+        <w:numPr>
+          <w:ilvl w:val="0"/>
+          <w:numId w:val="1009"/>
+        </w:numPr>
+      </w:pPr>
+      <w:r>
+        <w:t xml:space="preserve">Route. We will include medications that are orally administered. This is because oral medications are the most likely to be deprescribed in this population.</w:t>
+      </w:r>
+    </w:p>
+    <w:p>
+      <w:pPr>
+        <w:pStyle w:val="FirstParagraph"/>
+      </w:pPr>
+      <w:r>
+        <w:t xml:space="preserve">It will not be possible to distinguish PRN (as required) prescriptions from regular prescriptions, and so all medications will be assumed regular.</w:t>
+      </w:r>
+    </w:p>
+    <w:bookmarkEnd w:id="26"/>
+    <w:bookmarkStart w:id="27" w:name="uniqueness"/>
     <w:p>
       <w:pPr>
         <w:pStyle w:val="Heading3"/>
@@ -1152,11 +1197,11 @@
         <w:pStyle w:val="FirstParagraph"/>
       </w:pPr>
       <w:r>
-        <w:t xml:space="preserve">Combination products have distinct BNF substance codes and so will be counted as a single drug, which reflects their singular contribution towards pill count.</w:t>
-      </w:r>
-    </w:p>
-    <w:bookmarkEnd w:id="26"/>
-    <w:bookmarkStart w:id="27" w:name="timeframe"/>
+        <w:t xml:space="preserve">Combination products have distinct dm+d and BNF substance codes and so will be counted as a single drug.</w:t>
+      </w:r>
+    </w:p>
+    <w:bookmarkEnd w:id="27"/>
+    <w:bookmarkStart w:id="28" w:name="timeframe"/>
     <w:p>
       <w:pPr>
         <w:pStyle w:val="Heading3"/>
@@ -1170,7 +1215,7 @@
         <w:pStyle w:val="FirstParagraph"/>
       </w:pPr>
       <w:r>
-        <w:t xml:space="preserve">We will analyse medicines that we define as being</w:t>
+        <w:t xml:space="preserve">Conceptually, for a medicine to be discontinued, it must be first in</w:t>
       </w:r>
       <w:r>
         <w:t xml:space="preserve"> </w:t>
@@ -1183,23 +1228,10 @@
         <w:t xml:space="preserve">chronic</w:t>
       </w:r>
       <w:r>
-        <w:t xml:space="preserve">, as these are more eligible for discontinuation. Chronic prescriptions are those that a person is prescribed at the study entry and have been prescribed</w:t>
-      </w:r>
-      <w:r>
-        <w:t xml:space="preserve"> </w:t>
-      </w:r>
-      <w:r>
-        <w:rPr>
-          <w:i/>
-          <w:iCs/>
-        </w:rPr>
-        <w:t xml:space="preserve">regularly</w:t>
-      </w:r>
-      <w:r>
-        <w:t xml:space="preserve"> </w:t>
-      </w:r>
-      <w:r>
-        <w:t xml:space="preserve">prior to this. There is no consensus regarding how to define a chronic prescription within electronic health record data. OpenSAFELY-TPP lacks data to show the clinician-intended duration for each prescription, however for five common medicines, 92% of prescriptions appeared to be intended for 28 or 56 days, with the remainder being for 7 or 84 days</w:t>
+        <w:t xml:space="preserve"> </w:t>
+      </w:r>
+      <w:r>
+        <w:t xml:space="preserve">use, i.e. being used on the index date, and regularly prior to that. There is no consensus regarding how to define a chronic prescription within electronic health record data. OpenSAFELY-TPP lacks data to show the clinician-intended duration for each prescription, and therefore assumptions about the length of each prescription are required to establish what a person could have been taking on any given date. It has previously been shown that for five of the commonest medicines, 92% were prescribed for 28 or 56 days, with the remainder being prescribed for 7 or 84 days</w:t>
       </w:r>
       <w:r>
         <w:t xml:space="preserve"> </w:t>
@@ -1208,15 +1240,23 @@
         <w:t xml:space="preserve">(14)</w:t>
       </w:r>
       <w:r>
-        <w:t xml:space="preserve">. In our primary analysis, considering this variability and to be pragmatic, we will define a medication as chronic (and include it in our analyses) if it is prescribed:</w:t>
-      </w:r>
-    </w:p>
-    <w:p>
-      <w:pPr>
-        <w:pStyle w:val="Compact"/>
-        <w:numPr>
-          <w:ilvl w:val="0"/>
-          <w:numId w:val="1009"/>
+        <w:t xml:space="preserve">.</w:t>
+      </w:r>
+    </w:p>
+    <w:p>
+      <w:pPr>
+        <w:pStyle w:val="BodyText"/>
+      </w:pPr>
+      <w:r>
+        <w:t xml:space="preserve">Considering this variability, we will define a medication as chronic, and include it in our analyses, if it is prescribed:</w:t>
+      </w:r>
+    </w:p>
+    <w:p>
+      <w:pPr>
+        <w:pStyle w:val="Compact"/>
+        <w:numPr>
+          <w:ilvl w:val="0"/>
+          <w:numId w:val="1010"/>
         </w:numPr>
       </w:pPr>
       <w:r>
@@ -1228,7 +1268,7 @@
         <w:pStyle w:val="Compact"/>
         <w:numPr>
           <w:ilvl w:val="0"/>
-          <w:numId w:val="1009"/>
+          <w:numId w:val="1010"/>
         </w:numPr>
       </w:pPr>
       <w:r>
@@ -1249,9 +1289,9 @@
         <w:t xml:space="preserve">This effect of this definition on results will be explored through sensitivity analyses.</w:t>
       </w:r>
     </w:p>
-    <w:bookmarkEnd w:id="27"/>
     <w:bookmarkEnd w:id="28"/>
-    <w:bookmarkStart w:id="29" w:name="medication-discontinuation"/>
+    <w:bookmarkEnd w:id="29"/>
+    <w:bookmarkStart w:id="30" w:name="medication-discontinuation"/>
     <w:p>
       <w:pPr>
         <w:pStyle w:val="Heading2"/>
@@ -1291,8 +1331,8 @@
         <w:t xml:space="preserve">— modelling prior gaps? —</w:t>
       </w:r>
     </w:p>
-    <w:bookmarkEnd w:id="29"/>
-    <w:bookmarkStart w:id="33" w:name="covariates"/>
+    <w:bookmarkEnd w:id="30"/>
+    <w:bookmarkStart w:id="34" w:name="covariates"/>
     <w:p>
       <w:pPr>
         <w:pStyle w:val="Heading2"/>
@@ -1314,7 +1354,7 @@
         <w:pStyle w:val="Compact"/>
         <w:numPr>
           <w:ilvl w:val="0"/>
-          <w:numId w:val="1010"/>
+          <w:numId w:val="1011"/>
         </w:numPr>
       </w:pPr>
       <w:r>
@@ -1326,7 +1366,7 @@
         <w:pStyle w:val="Compact"/>
         <w:numPr>
           <w:ilvl w:val="0"/>
-          <w:numId w:val="1010"/>
+          <w:numId w:val="1011"/>
         </w:numPr>
       </w:pPr>
       <w:r>
@@ -1346,7 +1386,7 @@
         <w:pStyle w:val="Compact"/>
         <w:numPr>
           <w:ilvl w:val="0"/>
-          <w:numId w:val="1011"/>
+          <w:numId w:val="1012"/>
         </w:numPr>
       </w:pPr>
       <w:r>
@@ -1358,7 +1398,7 @@
         <w:pStyle w:val="Compact"/>
         <w:numPr>
           <w:ilvl w:val="0"/>
-          <w:numId w:val="1011"/>
+          <w:numId w:val="1012"/>
         </w:numPr>
       </w:pPr>
       <w:r>
@@ -1370,7 +1410,7 @@
         <w:pStyle w:val="Compact"/>
         <w:numPr>
           <w:ilvl w:val="0"/>
-          <w:numId w:val="1011"/>
+          <w:numId w:val="1012"/>
         </w:numPr>
       </w:pPr>
       <w:r>
@@ -1382,7 +1422,7 @@
         <w:pStyle w:val="Compact"/>
         <w:numPr>
           <w:ilvl w:val="0"/>
-          <w:numId w:val="1011"/>
+          <w:numId w:val="1012"/>
         </w:numPr>
       </w:pPr>
       <w:r>
@@ -1394,7 +1434,7 @@
         <w:pStyle w:val="Compact"/>
         <w:numPr>
           <w:ilvl w:val="0"/>
-          <w:numId w:val="1011"/>
+          <w:numId w:val="1012"/>
         </w:numPr>
       </w:pPr>
       <w:r>
@@ -1406,7 +1446,7 @@
         <w:pStyle w:val="Compact"/>
         <w:numPr>
           <w:ilvl w:val="0"/>
-          <w:numId w:val="1011"/>
+          <w:numId w:val="1012"/>
         </w:numPr>
       </w:pPr>
       <w:r>
@@ -1418,7 +1458,7 @@
         <w:pStyle w:val="Compact"/>
         <w:numPr>
           <w:ilvl w:val="0"/>
-          <w:numId w:val="1011"/>
+          <w:numId w:val="1012"/>
         </w:numPr>
       </w:pPr>
       <w:r>
@@ -1430,7 +1470,7 @@
         <w:pStyle w:val="Compact"/>
         <w:numPr>
           <w:ilvl w:val="0"/>
-          <w:numId w:val="1011"/>
+          <w:numId w:val="1012"/>
         </w:numPr>
       </w:pPr>
       <w:r>
@@ -1445,7 +1485,7 @@
         <w:t xml:space="preserve">— clinical events? e.g. falls/hospitalisations - probably would need to be examined longitudinally</w:t>
       </w:r>
     </w:p>
-    <w:bookmarkStart w:id="31" w:name="risk-of-mortality"/>
+    <w:bookmarkStart w:id="32" w:name="risk-of-mortality"/>
     <w:p>
       <w:pPr>
         <w:pStyle w:val="Heading3"/>
@@ -1464,7 +1504,7 @@
       <w:r>
         <w:t xml:space="preserve"> </w:t>
       </w:r>
-      <w:hyperlink r:id="rId30">
+      <w:hyperlink r:id="rId31">
         <w:r>
           <w:rPr>
             <w:rStyle w:val="Hyperlink"/>
@@ -1499,7 +1539,7 @@
         <w:pStyle w:val="Compact"/>
         <w:numPr>
           <w:ilvl w:val="0"/>
-          <w:numId w:val="1012"/>
+          <w:numId w:val="1013"/>
         </w:numPr>
       </w:pPr>
       <w:r>
@@ -1511,7 +1551,7 @@
         <w:pStyle w:val="Compact"/>
         <w:numPr>
           <w:ilvl w:val="0"/>
-          <w:numId w:val="1012"/>
+          <w:numId w:val="1013"/>
         </w:numPr>
       </w:pPr>
       <w:r>
@@ -1523,7 +1563,7 @@
         <w:pStyle w:val="Compact"/>
         <w:numPr>
           <w:ilvl w:val="0"/>
-          <w:numId w:val="1012"/>
+          <w:numId w:val="1013"/>
         </w:numPr>
       </w:pPr>
       <w:r>
@@ -1535,7 +1575,7 @@
         <w:pStyle w:val="Compact"/>
         <w:numPr>
           <w:ilvl w:val="0"/>
-          <w:numId w:val="1012"/>
+          <w:numId w:val="1013"/>
         </w:numPr>
       </w:pPr>
       <w:r>
@@ -1547,7 +1587,7 @@
         <w:pStyle w:val="Compact"/>
         <w:numPr>
           <w:ilvl w:val="0"/>
-          <w:numId w:val="1012"/>
+          <w:numId w:val="1013"/>
         </w:numPr>
       </w:pPr>
       <w:r>
@@ -1559,7 +1599,7 @@
         <w:pStyle w:val="Compact"/>
         <w:numPr>
           <w:ilvl w:val="0"/>
-          <w:numId w:val="1012"/>
+          <w:numId w:val="1013"/>
         </w:numPr>
       </w:pPr>
       <w:r>
@@ -1571,7 +1611,7 @@
         <w:pStyle w:val="Compact"/>
         <w:numPr>
           <w:ilvl w:val="0"/>
-          <w:numId w:val="1012"/>
+          <w:numId w:val="1013"/>
         </w:numPr>
       </w:pPr>
       <w:r>
@@ -1583,7 +1623,7 @@
         <w:pStyle w:val="Compact"/>
         <w:numPr>
           <w:ilvl w:val="0"/>
-          <w:numId w:val="1012"/>
+          <w:numId w:val="1013"/>
         </w:numPr>
       </w:pPr>
       <w:r>
@@ -1595,7 +1635,7 @@
         <w:pStyle w:val="Compact"/>
         <w:numPr>
           <w:ilvl w:val="0"/>
-          <w:numId w:val="1012"/>
+          <w:numId w:val="1013"/>
         </w:numPr>
       </w:pPr>
       <w:r>
@@ -1610,8 +1650,8 @@
         <w:t xml:space="preserve">Four strata will be viewed: &lt;25%, 25–49%, 50–74%, ≥75%</w:t>
       </w:r>
     </w:p>
-    <w:bookmarkEnd w:id="31"/>
-    <w:bookmarkStart w:id="32" w:name="frailty"/>
+    <w:bookmarkEnd w:id="32"/>
+    <w:bookmarkStart w:id="33" w:name="frailty"/>
     <w:p>
       <w:pPr>
         <w:pStyle w:val="Heading3"/>
@@ -1645,9 +1685,9 @@
         <w:t xml:space="preserve">Four strata will be viewed: non-frail, mildly frail, moderately frail, severely frail.</w:t>
       </w:r>
     </w:p>
-    <w:bookmarkEnd w:id="32"/>
     <w:bookmarkEnd w:id="33"/>
-    <w:bookmarkStart w:id="34" w:name="statistical-methods"/>
+    <w:bookmarkEnd w:id="34"/>
+    <w:bookmarkStart w:id="36" w:name="statistical-methods"/>
     <w:p>
       <w:pPr>
         <w:pStyle w:val="Heading2"/>
@@ -1656,8 +1696,26 @@
         <w:t xml:space="preserve">3.8 Statistical methods</w:t>
       </w:r>
     </w:p>
-    <w:bookmarkEnd w:id="34"/>
-    <w:bookmarkStart w:id="35" w:name="tables-and-figures"/>
+    <w:bookmarkStart w:id="35" w:name="sensitivity-analysis"/>
+    <w:p>
+      <w:pPr>
+        <w:pStyle w:val="Heading3"/>
+      </w:pPr>
+      <w:r>
+        <w:t xml:space="preserve">3.8.1 Sensitivity analysis</w:t>
+      </w:r>
+    </w:p>
+    <w:p>
+      <w:pPr>
+        <w:pStyle w:val="FirstParagraph"/>
+      </w:pPr>
+      <w:r>
+        <w:t xml:space="preserve">In sensitivity analyses, we will explore the effect of including drugs that are administered through other routes.</w:t>
+      </w:r>
+    </w:p>
+    <w:bookmarkEnd w:id="35"/>
+    <w:bookmarkEnd w:id="36"/>
+    <w:bookmarkStart w:id="37" w:name="tables-and-figures"/>
     <w:p>
       <w:pPr>
         <w:pStyle w:val="Heading2"/>
@@ -1666,8 +1724,8 @@
         <w:t xml:space="preserve">3.9 Tables and figures</w:t>
       </w:r>
     </w:p>
-    <w:bookmarkEnd w:id="35"/>
-    <w:bookmarkStart w:id="36" w:name="study-limitations"/>
+    <w:bookmarkEnd w:id="37"/>
+    <w:bookmarkStart w:id="38" w:name="study-limitations"/>
     <w:p>
       <w:pPr>
         <w:pStyle w:val="Heading2"/>
@@ -1676,9 +1734,9 @@
         <w:t xml:space="preserve">3.10 Study limitations</w:t>
       </w:r>
     </w:p>
-    <w:bookmarkEnd w:id="36"/>
-    <w:bookmarkEnd w:id="37"/>
-    <w:bookmarkStart w:id="40" w:name="other-information"/>
+    <w:bookmarkEnd w:id="38"/>
+    <w:bookmarkEnd w:id="39"/>
+    <w:bookmarkStart w:id="42" w:name="other-information"/>
     <w:p>
       <w:pPr>
         <w:pStyle w:val="Heading1"/>
@@ -1687,7 +1745,7 @@
         <w:t xml:space="preserve">4. Other information</w:t>
       </w:r>
     </w:p>
-    <w:bookmarkStart w:id="38" w:name="funding"/>
+    <w:bookmarkStart w:id="40" w:name="funding"/>
     <w:p>
       <w:pPr>
         <w:pStyle w:val="Heading2"/>
@@ -1696,8 +1754,8 @@
         <w:t xml:space="preserve">4.1 Funding</w:t>
       </w:r>
     </w:p>
-    <w:bookmarkEnd w:id="38"/>
-    <w:bookmarkStart w:id="39" w:name="ppie"/>
+    <w:bookmarkEnd w:id="40"/>
+    <w:bookmarkStart w:id="41" w:name="ppie"/>
     <w:p>
       <w:pPr>
         <w:pStyle w:val="Heading2"/>
@@ -1706,9 +1764,9 @@
         <w:t xml:space="preserve">4.2 PPIE</w:t>
       </w:r>
     </w:p>
-    <w:bookmarkEnd w:id="39"/>
-    <w:bookmarkEnd w:id="40"/>
-    <w:bookmarkStart w:id="72" w:name="references"/>
+    <w:bookmarkEnd w:id="41"/>
+    <w:bookmarkEnd w:id="42"/>
+    <w:bookmarkStart w:id="74" w:name="references"/>
     <w:p>
       <w:pPr>
         <w:pStyle w:val="Heading1"/>
@@ -1717,8 +1775,8 @@
         <w:t xml:space="preserve">References</w:t>
       </w:r>
     </w:p>
-    <w:bookmarkStart w:id="71" w:name="refs"/>
-    <w:bookmarkStart w:id="42" w:name="ref-Brown2024"/>
+    <w:bookmarkStart w:id="73" w:name="refs"/>
+    <w:bookmarkStart w:id="44" w:name="ref-Brown2024"/>
     <w:p>
       <w:pPr>
         <w:pStyle w:val="Bibliography"/>
@@ -1735,7 +1793,7 @@
       <w:r>
         <w:t xml:space="preserve">Brown JP, Hunnicutt JN, Ali MS, Bhaskaran K, Cole A, Langan SM, et al. Quantifying possible bias in clinical and epidemiological studies with quantitative bias analysis: Common approaches and limitations. BMJ. 2024;e076365. doi:</w:t>
       </w:r>
-      <w:hyperlink r:id="rId41">
+      <w:hyperlink r:id="rId43">
         <w:r>
           <w:rPr>
             <w:rStyle w:val="Hyperlink"/>
@@ -1744,8 +1802,8 @@
         </w:r>
       </w:hyperlink>
     </w:p>
-    <w:bookmarkEnd w:id="42"/>
-    <w:bookmarkStart w:id="44" w:name="ref-Hawthorne2023"/>
+    <w:bookmarkEnd w:id="44"/>
+    <w:bookmarkStart w:id="46" w:name="ref-Hawthorne2023"/>
     <w:p>
       <w:pPr>
         <w:pStyle w:val="Bibliography"/>
@@ -1774,7 +1832,7 @@
       <w:r>
         <w:t xml:space="preserve">cohort study. International Urology and Nephrology. 2023;55(8):2047–57. doi:</w:t>
       </w:r>
-      <w:hyperlink r:id="rId43">
+      <w:hyperlink r:id="rId45">
         <w:r>
           <w:rPr>
             <w:rStyle w:val="Hyperlink"/>
@@ -1783,8 +1841,8 @@
         </w:r>
       </w:hyperlink>
     </w:p>
-    <w:bookmarkEnd w:id="44"/>
-    <w:bookmarkStart w:id="46" w:name="ref-vanOosten2021"/>
+    <w:bookmarkEnd w:id="46"/>
+    <w:bookmarkStart w:id="48" w:name="ref-vanOosten2021"/>
     <w:p>
       <w:pPr>
         <w:pStyle w:val="Bibliography"/>
@@ -1801,7 +1859,7 @@
       <w:r>
         <w:t xml:space="preserve">Oosten MJM van, Logtenberg SJJ, Hemmellder MH, Leegte MJH, Bilo HJG, Jager KJ, et al. Polypharmacy and medication use in patients with chronic kidney disease with and without kidney replacement therapy compared to matched controls. Clinical Kidney Journal. 2021;14(12):2497–523. doi:</w:t>
       </w:r>
-      <w:hyperlink r:id="rId45">
+      <w:hyperlink r:id="rId47">
         <w:r>
           <w:rPr>
             <w:rStyle w:val="Hyperlink"/>
@@ -1810,8 +1868,8 @@
         </w:r>
       </w:hyperlink>
     </w:p>
-    <w:bookmarkEnd w:id="46"/>
-    <w:bookmarkStart w:id="48" w:name="ref-Fried2014"/>
+    <w:bookmarkEnd w:id="48"/>
+    <w:bookmarkStart w:id="50" w:name="ref-Fried2014"/>
     <w:p>
       <w:pPr>
         <w:pStyle w:val="Bibliography"/>
@@ -1828,7 +1886,7 @@
       <w:r>
         <w:t xml:space="preserve">Fried TR, O’Leary J, Towle V, Goldstein MK, Trentalange M, Martin DK. Health outcomes associated with polypharmacy in community-dwelling older adults: A systematic review. Journal of the American Geriatrics Society. 2014;62(12):2261–72. doi:</w:t>
       </w:r>
-      <w:hyperlink r:id="rId47">
+      <w:hyperlink r:id="rId49">
         <w:r>
           <w:rPr>
             <w:rStyle w:val="Hyperlink"/>
@@ -1837,8 +1895,8 @@
         </w:r>
       </w:hyperlink>
     </w:p>
-    <w:bookmarkEnd w:id="48"/>
-    <w:bookmarkStart w:id="49" w:name="ref-WHO2023"/>
+    <w:bookmarkEnd w:id="50"/>
+    <w:bookmarkStart w:id="51" w:name="ref-WHO2023"/>
     <w:p>
       <w:pPr>
         <w:pStyle w:val="Bibliography"/>
@@ -1856,8 +1914,8 @@
         <w:t xml:space="preserve">World Health Organization. Medication without harm: Policy brief. World Health Organization; 2023.</w:t>
       </w:r>
     </w:p>
-    <w:bookmarkEnd w:id="49"/>
-    <w:bookmarkStart w:id="50" w:name="ref-Mohottige2021"/>
+    <w:bookmarkEnd w:id="51"/>
+    <w:bookmarkStart w:id="52" w:name="ref-Mohottige2021"/>
     <w:p>
       <w:pPr>
         <w:pStyle w:val="Bibliography"/>
@@ -1875,8 +1933,8 @@
         <w:t xml:space="preserve">Mohottige D, Manley HJ, Hall RK. Less is more: Deprescribing medications in older adults with kidney disease: A review. Kidney360. 2021;2(9):1510–22.</w:t>
       </w:r>
     </w:p>
-    <w:bookmarkEnd w:id="50"/>
-    <w:bookmarkStart w:id="52" w:name="ref-Colombijn2024"/>
+    <w:bookmarkEnd w:id="52"/>
+    <w:bookmarkStart w:id="54" w:name="ref-Colombijn2024"/>
     <w:p>
       <w:pPr>
         <w:pStyle w:val="Bibliography"/>
@@ -1893,7 +1951,7 @@
       <w:r>
         <w:t xml:space="preserve">Colombijn JMT, Idema DL, Van Beem S, Blokland AM, Van Der Braak K, Handoko ML, et al. Representation of patients with chronic kidney disease in clinical trials of cardiovascular disease medications. JAMA Network Open. 2024;7(3):e240427. doi:</w:t>
       </w:r>
-      <w:hyperlink r:id="rId51">
+      <w:hyperlink r:id="rId53">
         <w:r>
           <w:rPr>
             <w:rStyle w:val="Hyperlink"/>
@@ -1902,8 +1960,8 @@
         </w:r>
       </w:hyperlink>
     </w:p>
-    <w:bookmarkEnd w:id="52"/>
-    <w:bookmarkStart w:id="54" w:name="ref-Stevens2024"/>
+    <w:bookmarkEnd w:id="54"/>
+    <w:bookmarkStart w:id="56" w:name="ref-Stevens2024"/>
     <w:p>
       <w:pPr>
         <w:pStyle w:val="Bibliography"/>
@@ -1932,7 +1990,7 @@
       <w:r>
         <w:t xml:space="preserve">2024 clinical practice guideline for the evaluation and management of chronic kidney disease. Kidney International. 2024;105(4):S117–314. doi:</w:t>
       </w:r>
-      <w:hyperlink r:id="rId53">
+      <w:hyperlink r:id="rId55">
         <w:r>
           <w:rPr>
             <w:rStyle w:val="Hyperlink"/>
@@ -1941,8 +1999,8 @@
         </w:r>
       </w:hyperlink>
     </w:p>
-    <w:bookmarkEnd w:id="54"/>
-    <w:bookmarkStart w:id="56" w:name="ref-Letts2024"/>
+    <w:bookmarkEnd w:id="56"/>
+    <w:bookmarkStart w:id="58" w:name="ref-Letts2024"/>
     <w:p>
       <w:pPr>
         <w:pStyle w:val="Bibliography"/>
@@ -1959,7 +2017,7 @@
       <w:r>
         <w:t xml:space="preserve">Letts M, Chesnaye NC, Pippias M, Caskey F, Jager KJ, Dekker FW, et al. Prescribing patterns in older people with advanced chronic kidney disease towards the end of life. Clinical Kidney Journal. 2024. doi:</w:t>
       </w:r>
-      <w:hyperlink r:id="rId55">
+      <w:hyperlink r:id="rId57">
         <w:r>
           <w:rPr>
             <w:rStyle w:val="Hyperlink"/>
@@ -1968,8 +2026,8 @@
         </w:r>
       </w:hyperlink>
     </w:p>
-    <w:bookmarkEnd w:id="56"/>
-    <w:bookmarkStart w:id="58" w:name="ref-DHSC2021"/>
+    <w:bookmarkEnd w:id="58"/>
+    <w:bookmarkStart w:id="60" w:name="ref-DHSC2021"/>
     <w:p>
       <w:pPr>
         <w:pStyle w:val="Bibliography"/>
@@ -1989,7 +2047,7 @@
       <w:r>
         <w:t xml:space="preserve"> </w:t>
       </w:r>
-      <w:hyperlink r:id="rId57">
+      <w:hyperlink r:id="rId59">
         <w:r>
           <w:rPr>
             <w:rStyle w:val="Hyperlink"/>
@@ -1998,8 +2056,8 @@
         </w:r>
       </w:hyperlink>
     </w:p>
-    <w:bookmarkEnd w:id="58"/>
-    <w:bookmarkStart w:id="59" w:name="ref-Sparks2025"/>
+    <w:bookmarkEnd w:id="60"/>
+    <w:bookmarkStart w:id="61" w:name="ref-Sparks2025"/>
     <w:p>
       <w:pPr>
         <w:pStyle w:val="Bibliography"/>
@@ -2017,8 +2075,8 @@
         <w:t xml:space="preserve">Sparks C, Steinberg AG, Toussaint ND. Identifying and characterising a chronic kidney disease electronic-phenotype using electronic health record-derived data: A narrative review of strategies and applications. Nephrology. 2025;30(9).</w:t>
       </w:r>
     </w:p>
-    <w:bookmarkEnd w:id="59"/>
-    <w:bookmarkStart w:id="61" w:name="ref-Santhakumaran2024"/>
+    <w:bookmarkEnd w:id="61"/>
+    <w:bookmarkStart w:id="63" w:name="ref-Santhakumaran2024"/>
     <w:p>
       <w:pPr>
         <w:pStyle w:val="Bibliography"/>
@@ -2059,7 +2117,7 @@
       <w:r>
         <w:t xml:space="preserve">renal registry. BMJ Medicine. 2024;3(1):e000807. doi:</w:t>
       </w:r>
-      <w:hyperlink r:id="rId60">
+      <w:hyperlink r:id="rId62">
         <w:r>
           <w:rPr>
             <w:rStyle w:val="Hyperlink"/>
@@ -2068,8 +2126,8 @@
         </w:r>
       </w:hyperlink>
     </w:p>
-    <w:bookmarkEnd w:id="61"/>
-    <w:bookmarkStart w:id="63" w:name="ref-Goedken2016"/>
+    <w:bookmarkEnd w:id="63"/>
+    <w:bookmarkStart w:id="65" w:name="ref-Goedken2016"/>
     <w:p>
       <w:pPr>
         <w:pStyle w:val="Bibliography"/>
@@ -2086,7 +2144,7 @@
       <w:r>
         <w:t xml:space="preserve">Goedken AM, Lund BC, Cook EA, Schroeder MC, Brooks JM. Application of a framework for determining number of drugs. BMC Research Notes. 2016;9(1). doi:</w:t>
       </w:r>
-      <w:hyperlink r:id="rId62">
+      <w:hyperlink r:id="rId64">
         <w:r>
           <w:rPr>
             <w:rStyle w:val="Hyperlink"/>
@@ -2095,8 +2153,8 @@
         </w:r>
       </w:hyperlink>
     </w:p>
-    <w:bookmarkEnd w:id="63"/>
-    <w:bookmarkStart w:id="65" w:name="ref-Mackenna2025"/>
+    <w:bookmarkEnd w:id="65"/>
+    <w:bookmarkStart w:id="67" w:name="ref-Mackenna2025"/>
     <w:p>
       <w:pPr>
         <w:pStyle w:val="Bibliography"/>
@@ -2122,7 +2180,7 @@
       <w:r>
         <w:t xml:space="preserve">. British Journal of General Practice. 2025;75(756):e448–56. doi:</w:t>
       </w:r>
-      <w:hyperlink r:id="rId64">
+      <w:hyperlink r:id="rId66">
         <w:r>
           <w:rPr>
             <w:rStyle w:val="Hyperlink"/>
@@ -2131,8 +2189,8 @@
         </w:r>
       </w:hyperlink>
     </w:p>
-    <w:bookmarkEnd w:id="65"/>
-    <w:bookmarkStart w:id="67" w:name="ref-Bayliss2025"/>
+    <w:bookmarkEnd w:id="67"/>
+    <w:bookmarkStart w:id="69" w:name="ref-Bayliss2025"/>
     <w:p>
       <w:pPr>
         <w:pStyle w:val="Bibliography"/>
@@ -2149,7 +2207,7 @@
       <w:r>
         <w:t xml:space="preserve">Bayliss EA, Goodrich GK, Barrow JC, Harding B, Ripley CA, Kraus CR, et al. Discontinuation categories underlying gaps in dispensing for six medication groups. Pharmacoepidemiology and Drug Safety. 2025;34(4). doi:</w:t>
       </w:r>
-      <w:hyperlink r:id="rId66">
+      <w:hyperlink r:id="rId68">
         <w:r>
           <w:rPr>
             <w:rStyle w:val="Hyperlink"/>
@@ -2158,8 +2216,8 @@
         </w:r>
       </w:hyperlink>
     </w:p>
-    <w:bookmarkEnd w:id="67"/>
-    <w:bookmarkStart w:id="68" w:name="ref-Grams2018"/>
+    <w:bookmarkEnd w:id="69"/>
+    <w:bookmarkStart w:id="70" w:name="ref-Grams2018"/>
     <w:p>
       <w:pPr>
         <w:pStyle w:val="Bibliography"/>
@@ -2180,8 +2238,8 @@
         <w:t xml:space="preserve"> Predicting timing of clinical outcomes in patients with chronic kidney disease and severely decreased glomerular filtration rate. Kidney International. 2018;93(6):1442–51.</w:t>
       </w:r>
     </w:p>
-    <w:bookmarkEnd w:id="68"/>
-    <w:bookmarkStart w:id="70" w:name="ref-Best2025"/>
+    <w:bookmarkEnd w:id="70"/>
+    <w:bookmarkStart w:id="72" w:name="ref-Best2025"/>
     <w:p>
       <w:pPr>
         <w:pStyle w:val="Bibliography"/>
@@ -2198,7 +2256,7 @@
       <w:r>
         <w:t xml:space="preserve">Best K, Shuweihdi F, Alvarez JCB, Relton S, Avgerinou C, Nimmons D, et al. Development and external validation of the electronic frailty index 2 using routine primary care electronic health record data. Age and Ageing. 2025;54(4). doi:</w:t>
       </w:r>
-      <w:hyperlink r:id="rId69">
+      <w:hyperlink r:id="rId71">
         <w:r>
           <w:rPr>
             <w:rStyle w:val="Hyperlink"/>
@@ -2207,9 +2265,9 @@
         </w:r>
       </w:hyperlink>
     </w:p>
-    <w:bookmarkEnd w:id="70"/>
-    <w:bookmarkEnd w:id="71"/>
     <w:bookmarkEnd w:id="72"/>
+    <w:bookmarkEnd w:id="73"/>
+    <w:bookmarkEnd w:id="74"/>
     <w:sectPr>
       <w:footnotePr>
         <w:numRestart w:val="eachSect"/>
@@ -2657,6 +2715,9 @@
     <w:abstractNumId w:val="991"/>
   </w:num>
   <w:num w:numId="1012">
+    <w:abstractNumId w:val="991"/>
+  </w:num>
+  <w:num w:numId="1013">
     <w:abstractNumId w:val="99711"/>
     <w:lvlOverride w:ilvl="0">
       <w:startOverride w:val="1"/>

</xml_diff>